<commit_message>
docs: describe GIS architecture in conference abstract
</commit_message>
<xml_diff>
--- a/output/docx/Тезисы_оценка_влажности_почвы_по_ДЗЗ_и_модели.docx
+++ b/output/docx/Тезисы_оценка_влажности_почвы_по_ДЗЗ_и_модели.docx
@@ -85,21 +85,17 @@
       </w:pPr>
       <w:r>
         <w:rPr>
-          <w:rFonts w:ascii="Times New Roman" w:hAnsi="Times New Roman"/>
+          <w:rFonts w:ascii="Times New Roman" w:hAnsi="Times New Roman" w:cs="Times New Roman"/>
           <w:b/>
-          <w:i w:val="0"/>
-          <w:sz w:val="24"/>
         </w:rPr>
         <w:t xml:space="preserve">Аннотация. </w:t>
       </w:r>
       <w:r>
         <w:rPr>
-          <w:rFonts w:ascii="Times New Roman" w:hAnsi="Times New Roman"/>
+          <w:rFonts w:ascii="Times New Roman" w:hAnsi="Times New Roman" w:cs="Times New Roman"/>
           <w:b w:val="0"/>
-          <w:i w:val="0"/>
-          <w:sz w:val="24"/>
         </w:rPr>
-        <w:t>Предложен подход к оценке пространственно распределённой влажности почвы на сельскохозяйственных полях на основе точечных наземных измерений, продуктов Sentinel-2 и физически обоснованного моделирования. Для вегетационного периода 2026 года рассчитываются индексы NDVI, NDWI и анализируется продукт FCOVER. Спутниковые показатели сопоставляются с модельными характеристиками развития растительного покрова и запасов влаги. Подход обеспечивает переход от локальных показаний датчиков к оценке состояния всего поля для управления поливами.</w:t>
+        <w:t>Представлена архитектура геоинформационной системы оценки состояния сельскохозяйственных полей, реализованной как персональный плагин QGIS. Система объединяет границы полей, сцены Sentinel-2 и Sentinel-1, суточные модельные ряды КОРНИКС и метеоданные. Для вегетационного периода 2026 года формируются временные ряды NDVI, NDMI, NDRE, SAVI, FCOVER и радиолокационных поляризаций VV/VH. Данные обрабатываются по каждому полю, а результаты доступны на карте и в синхронных графиках QGIS.</w:t>
       </w:r>
     </w:p>
     <w:p>
@@ -110,21 +106,10 @@
       </w:pPr>
       <w:r>
         <w:rPr>
-          <w:rFonts w:ascii="Times New Roman" w:hAnsi="Times New Roman"/>
-          <w:b/>
-          <w:i w:val="0"/>
-          <w:sz w:val="24"/>
+          <w:rFonts w:ascii="Times New Roman" w:hAnsi="Times New Roman" w:cs="Times New Roman"/>
+          <w:b w:val="0"/>
         </w:rPr>
-        <w:t xml:space="preserve">Ключевые слова: </w:t>
-      </w:r>
-      <w:r>
-        <w:rPr>
-          <w:rFonts w:ascii="Times New Roman" w:hAnsi="Times New Roman"/>
-          <w:b w:val="0"/>
-          <w:i w:val="0"/>
-          <w:sz w:val="24"/>
-        </w:rPr>
-        <w:t>влажность почвы, дистанционное зондирование Земли, Sentinel-2, NDVI, NDWI, FCOVER, орошение, математическое моделирование.</w:t>
+        <w:t>Ключевые слова: влажность почвы, дистанционное зондирование Земли, QGIS, Sentinel-1, Sentinel-2, FCOVER, КОРНИКС, геоинформационная система.</w:t>
       </w:r>
     </w:p>
     <w:p>
@@ -160,12 +145,10 @@
       </w:pPr>
       <w:r>
         <w:rPr>
-          <w:rFonts w:ascii="Times New Roman" w:hAnsi="Times New Roman"/>
+          <w:rFonts w:ascii="Times New Roman" w:hAnsi="Times New Roman" w:cs="Times New Roman"/>
           <w:b w:val="0"/>
-          <w:i w:val="0"/>
-          <w:sz w:val="24"/>
         </w:rPr>
-        <w:t>Спутниковые данные Sentinel-2 с разрешением до 10 м позволяют наблюдать развитие посевов. Индексы рассчитываются по отражательной способности поверхности: NDVI = (ρNIR − ρRED) / (ρNIR + ρRED), где для Sentinel-2 используются канал B8 ближнего инфракрасного диапазона (NIR, 10 м) и канал B4 красного диапазона (RED, 10 м). Рост NDVI обычно соответствует увеличению доли фотосинтезирующей биомассы; низкие значения характерны для открытой почвы, а отрицательные — для воды, облаков или теней.</w:t>
+        <w:t>Спутниковые данные Sentinel-2 с разрешением 10 м позволяют наблюдать развитие посевов. В системе рассчитываются NDVI, NDMI, NDRE и SAVI; облака, тени и снег исключаются по классификации SCL. Отдельно по SNAP-совместимой биофизической схеме рассчитывается FCOVER — доля площади пикселя, занятой зелёной растительностью [1, 2].</w:t>
       </w:r>
     </w:p>
     <w:p>
@@ -176,12 +159,17 @@
       </w:pPr>
       <w:r>
         <w:rPr>
-          <w:rFonts w:ascii="Times New Roman" w:hAnsi="Times New Roman"/>
+          <w:rFonts w:ascii="Times New Roman" w:hAnsi="Times New Roman" w:cs="Times New Roman"/>
+          <w:b/>
+        </w:rPr>
+        <w:t xml:space="preserve">Архитектура информационной системы. </w:t>
+      </w:r>
+      <w:r>
+        <w:rPr>
+          <w:rFonts w:ascii="Times New Roman" w:hAnsi="Times New Roman" w:cs="Times New Roman"/>
           <w:b w:val="0"/>
-          <w:i w:val="0"/>
-          <w:sz w:val="24"/>
         </w:rPr>
-        <w:t>Для оценки водного состояния растительного покрова рассчитывается NDWI = (ρNIR − ρSWIR) / (ρNIR + ρSWIR), где ρSWIR — отражательная способность канала B11 коротковолнового инфракрасного диапазона; перед расчётом B11 приводится к разрешению 10 м. Более высокие значения NDWI указывают на большее содержание влаги в растительности, однако индекс следует интерпретировать совместно с NDVI и метеоданными. FCOVER — безразмерный спутниковый продукт от 0 до 1, характеризующий долю площади пикселя, занятую зелёной растительностью. Его сопоставление с модельной долей покрытия поля позволяет независимо проверить динамику развития посевов [1, 2].</w:t>
+        <w:t>Система реализована как личный плагин Water Regime GIS для QGIS на macOS: меню, панель инструментов и dock-панель запускают PyQGIS/GDAL-операции в фоновых задачах QgsTask. Пользователь выбирает поле на карте; его граница уточняется через НСПД WMS GetFeatureInfo, а при отсутствии подходящего контура используется рабочий буфер. Microsoft Planetary Computer STAC поставляет Sentinel-2 L2A и Sentinel-1 RTC, которые GDAL читает как COG через /vsicurl/. Обрезанные GeoTIFF, маски облачности и таблицы зональных средних сохраняются локально; плагин строит по ним графики для выбранного поля. Отдельных веб-сервиса, HTTP API и многопользовательского режима в проекте нет.</w:t>
       </w:r>
     </w:p>
     <w:p>
@@ -192,21 +180,17 @@
       </w:pPr>
       <w:r>
         <w:rPr>
-          <w:rFonts w:ascii="Times New Roman" w:hAnsi="Times New Roman"/>
+          <w:rFonts w:ascii="Times New Roman" w:hAnsi="Times New Roman" w:cs="Times New Roman"/>
           <w:b/>
-          <w:i w:val="0"/>
-          <w:sz w:val="24"/>
         </w:rPr>
         <w:t xml:space="preserve">Материалы и методы. </w:t>
       </w:r>
       <w:r>
         <w:rPr>
-          <w:rFonts w:ascii="Times New Roman" w:hAnsi="Times New Roman"/>
+          <w:rFonts w:ascii="Times New Roman" w:hAnsi="Times New Roman" w:cs="Times New Roman"/>
           <w:b w:val="0"/>
-          <w:i w:val="0"/>
-          <w:sz w:val="24"/>
         </w:rPr>
-        <w:t>Исследование выполняется для рассматриваемых полей с апреля по август 2026 года. Используются измерения датчиков, сцены Sentinel-2, продукт поверхностной влажности по Sentinel-1, границы полей и метеорологические данные. Обработка включает отбор безоблачных сцен, маскирование облаков и расчёт NDVI, NDWI и FCOVER.</w:t>
+        <w:t>Анализ охватывает поля SP с апреля по август 2026 года. Используются границы полей, безоблачные сцены Sentinel-2, Sentinel-1 RTC, суточные модельные ряды КОРНИКС и метеорологические данные. Для Sentinel-2 отбираются сцены с глобальной облачностью не выше 10%; дополнительно исключаются сцены с облачностью внутри поля более 20%. Временные ряды индексов и FCOVER рассчитываются как зональные средние валидных пикселей.</w:t>
       </w:r>
     </w:p>
     <w:p>
@@ -217,12 +201,10 @@
       </w:pPr>
       <w:r>
         <w:rPr>
-          <w:rFonts w:ascii="Times New Roman" w:hAnsi="Times New Roman"/>
+          <w:rFonts w:ascii="Times New Roman" w:hAnsi="Times New Roman" w:cs="Times New Roman"/>
           <w:b w:val="0"/>
-          <w:i w:val="0"/>
-          <w:sz w:val="24"/>
         </w:rPr>
-        <w:t>Модель водного баланса рассчитывает развитие растений и влажность почвы с учётом осадков, поливов, испарения, транспирации и запасов влаги. Значения поверхностной влажности Sentinel-1 для слоя 5-10 см сопоставляются с расчётной влажностью той же глубины; учитывается влияние растительности и шероховатости на радиолокационный сигнал [3]. Модель проверяется по наземным измерениям с использованием MAE, RMSE и R².</w:t>
+        <w:t>Для Sentinel-1 сохраняются VV и VH каждого RTC-снимка, а зональное среднее вычисляется в dB как 10·log10 от среднего линейного обратного рассеяния. В QGIS ряд VV показывается как относительный индикатор влажности на общей сезонной шкале; он не интерпретируется как процент влажности без калибровки наземными измерениями. Ряды Sentinel-2 и Sentinel-1 объединяются с КОРНИКС по нормализованному идентификатору поля и точной дате [3].</w:t>
       </w:r>
     </w:p>
     <w:p>
@@ -233,21 +215,17 @@
       </w:pPr>
       <w:r>
         <w:rPr>
-          <w:rFonts w:ascii="Times New Roman" w:hAnsi="Times New Roman"/>
+          <w:rFonts w:ascii="Times New Roman" w:hAnsi="Times New Roman" w:cs="Times New Roman"/>
           <w:b/>
-          <w:i w:val="0"/>
-          <w:sz w:val="24"/>
         </w:rPr>
         <w:t xml:space="preserve">Результаты и обсуждение. </w:t>
       </w:r>
       <w:r>
         <w:rPr>
-          <w:rFonts w:ascii="Times New Roman" w:hAnsi="Times New Roman"/>
+          <w:rFonts w:ascii="Times New Roman" w:hAnsi="Times New Roman" w:cs="Times New Roman"/>
           <w:b w:val="0"/>
-          <w:i w:val="0"/>
-          <w:sz w:val="24"/>
         </w:rPr>
-        <w:t>Получены временные ряды NDVI, NDWI, FCOVER, поверхностной влажности Sentinel-1 и модельных характеристик. FCOVER сопоставляется с модельной долей покрытия поля, а Sentinel-1 — с модельной влажностью верхнего слоя, что дополняет проверку результатов между точками датчиков. В период активной вегетации рост FCOVER и NDVI сопровождается изменением модельной транспирации и влагозапаса.</w:t>
+        <w:t>Для 37 полей сформированы временные ряды спутниковых индексов, FCOVER, VV/VH и суточных показателей КОРНИКС. В интерфейсе QGIS для выбранного поля синхронно отображаются сезонные кривые Sentinel-2, модельные покрытие, Ks, влага 0–10 см и ET/PET, а также радиолокационный индикатор. Это позволяет сопоставлять динамику без подмены модельных рядов независимыми наземными измерениями.</w:t>
       </w:r>
     </w:p>
     <w:p>
@@ -258,12 +236,10 @@
       </w:pPr>
       <w:r>
         <w:rPr>
-          <w:rFonts w:ascii="Times New Roman" w:hAnsi="Times New Roman"/>
+          <w:rFonts w:ascii="Times New Roman" w:hAnsi="Times New Roman" w:cs="Times New Roman"/>
           <w:b w:val="0"/>
-          <w:i w:val="0"/>
-          <w:sz w:val="24"/>
         </w:rPr>
-        <w:t>Совмещение спутниковых и модельных показателей позволяет формировать карты влагообеспеченности поля; в окончательную версию включаются MAE, RMSE, R² и показатели связи индексов с модельной динамикой растительности.</w:t>
+        <w:t>Точное объединение Sentinel-2 с методом КОРНИКС ivanov_n4l_meteo_soil дало 433 совпадения «поле–дата». Сопоставление FCOVER с ожидаемым покрытием выполняется отдельно для каждого поля, а связь Sentinel-1 с модельной влагой оценивается с учётом сумм осадков и полива за 3 и 7 суток. Эти результаты являются пилотной проверкой согласованности источников, а не калибровкой по наземной влаге.</w:t>
       </w:r>
     </w:p>
     <w:p>
@@ -274,21 +250,17 @@
       </w:pPr>
       <w:r>
         <w:rPr>
-          <w:rFonts w:ascii="Times New Roman" w:hAnsi="Times New Roman"/>
+          <w:rFonts w:ascii="Times New Roman" w:hAnsi="Times New Roman" w:cs="Times New Roman"/>
           <w:b/>
-          <w:i w:val="0"/>
-          <w:sz w:val="24"/>
         </w:rPr>
         <w:t xml:space="preserve">Заключение. </w:t>
       </w:r>
       <w:r>
         <w:rPr>
-          <w:rFonts w:ascii="Times New Roman" w:hAnsi="Times New Roman"/>
+          <w:rFonts w:ascii="Times New Roman" w:hAnsi="Times New Roman" w:cs="Times New Roman"/>
           <w:b w:val="0"/>
-          <w:i w:val="0"/>
-          <w:sz w:val="24"/>
         </w:rPr>
-        <w:t>Для оценки влажности глубже верхнего слоя почвы необходима физически обоснованная модель, входами которой являются погодные данные и свойства почвы. Параметры развития растительности задаются по FCOVER с точностью, оцениваемой сопоставлением с модельной долей покрытия. Совмещение Sentinel-1, Sentinel-2, наземных измерений и модели обеспечивает пространственную оценку состояния поля для управления поливами.</w:t>
+        <w:t>Созданная QGIS-система обеспечивает воспроизводимую обработку спутниковых данных и модельных рядов по отдельным полям и их визуальное сопоставление. Sentinel-1 в текущем проекте служит относительным proxy, а не измерением влажности в процентах. Следующий этап — подключение реальных наземных измерений для калибровки и независимой проверки оценок влажности.</w:t>
       </w:r>
     </w:p>
     <w:p>

</xml_diff>

<commit_message>
docs: refactor conference abstract prose
</commit_message>
<xml_diff>
--- a/output/docx/Тезисы_оценка_влажности_почвы_по_ДЗЗ_и_модели.docx
+++ b/output/docx/Тезисы_оценка_влажности_почвы_по_ДЗЗ_и_модели.docx
@@ -95,7 +95,7 @@
           <w:rFonts w:ascii="Times New Roman" w:hAnsi="Times New Roman" w:cs="Times New Roman"/>
           <w:b w:val="0"/>
         </w:rPr>
-        <w:t>Представлена архитектура геоинформационной системы оценки состояния сельскохозяйственных полей, реализованной как персональный плагин QGIS. Система объединяет границы полей, сцены Sentinel-2 и Sentinel-1, суточные модельные ряды КОРНИКС и метеоданные. Для вегетационного периода 2026 года формируются временные ряды NDVI, NDMI, NDRE, SAVI, FCOVER и радиолокационных поляризаций VV/VH. Данные обрабатываются по каждому полю, а результаты доступны на карте и в синхронных графиках QGIS.</w:t>
+        <w:t>В работе описана геоинформационная система для оценки состояния сельскохозяйственных полей, реализованная как персональный плагин QGIS. Она объединяет границы полей, сцены Sentinel-2 и Sentinel-1, суточные модельные ряды КОРНИКС и метеоданные. За вегетационный период 2026 года система формирует временные ряды NDVI, NDMI, NDRE, SAVI, FCOVER и поляризаций VV/VH. Результаты рассчитываются по каждому полю и выводятся на карту и в синхронные графики QGIS.</w:t>
       </w:r>
     </w:p>
     <w:p>
@@ -120,21 +120,17 @@
       </w:pPr>
       <w:r>
         <w:rPr>
-          <w:rFonts w:ascii="Times New Roman" w:hAnsi="Times New Roman"/>
+          <w:rFonts w:ascii="Times New Roman" w:hAnsi="Times New Roman" w:cs="Times New Roman"/>
           <w:b/>
-          <w:i w:val="0"/>
-          <w:sz w:val="24"/>
         </w:rPr>
         <w:t xml:space="preserve">Введение. </w:t>
       </w:r>
       <w:r>
         <w:rPr>
-          <w:rFonts w:ascii="Times New Roman" w:hAnsi="Times New Roman"/>
+          <w:rFonts w:ascii="Times New Roman" w:hAnsi="Times New Roman" w:cs="Times New Roman"/>
           <w:b w:val="0"/>
-          <w:i w:val="0"/>
-          <w:sz w:val="24"/>
         </w:rPr>
-        <w:t>Эффективное управление поливами требует своевременной оценки влагообеспеченности посевов. Датчики влажности характеризуют лишь отдельные точки и не отражают неоднородность поля, обусловленную свойствами почв, микрорельефом и состоянием растительного покрова. Поэтому актуальна задача восстановления пространственной картины влажности по данным для всей площади поля.</w:t>
+        <w:t>Для управления поливом нужна своевременная оценка влагообеспеченности посевов. Точечные датчики влажности не показывают неоднородность поля, связанную со свойствами почвы, микрорельефом и состоянием растительного покрова. Поэтому состояние поля приходится оценивать по данным, охватывающим всю его площадь.</w:t>
       </w:r>
     </w:p>
     <w:p>
@@ -148,7 +144,7 @@
           <w:rFonts w:ascii="Times New Roman" w:hAnsi="Times New Roman" w:cs="Times New Roman"/>
           <w:b w:val="0"/>
         </w:rPr>
-        <w:t>Спутниковые данные Sentinel-2 с разрешением 10 м позволяют наблюдать развитие посевов. В системе рассчитываются NDVI, NDMI, NDRE и SAVI; облака, тени и снег исключаются по классификации SCL. Отдельно по SNAP-совместимой биофизической схеме рассчитывается FCOVER — доля площади пикселя, занятой зелёной растительностью [1, 2].</w:t>
+        <w:t>Снимки Sentinel-2 с разрешением 10 м позволяют проследить развитие посевов. В системе рассчитываются NDVI, NDMI, NDRE и SAVI; облака, тени и снег отсеиваются по классификации SCL. По SNAP-совместимой биофизической схеме отдельно определяется FCOVER — доля пикселя, занятая зелёной растительностью [1, 2].</w:t>
       </w:r>
     </w:p>
     <w:p>
@@ -169,7 +165,7 @@
           <w:rFonts w:ascii="Times New Roman" w:hAnsi="Times New Roman" w:cs="Times New Roman"/>
           <w:b w:val="0"/>
         </w:rPr>
-        <w:t>Система реализована как личный плагин Water Regime GIS для QGIS на macOS: меню, панель инструментов и dock-панель запускают PyQGIS/GDAL-операции в фоновых задачах QgsTask. Пользователь выбирает поле на карте; его граница уточняется через НСПД WMS GetFeatureInfo, а при отсутствии подходящего контура используется рабочий буфер. Microsoft Planetary Computer STAC поставляет Sentinel-2 L2A и Sentinel-1 RTC, которые GDAL читает как COG через /vsicurl/. Обрезанные GeoTIFF, маски облачности и таблицы зональных средних сохраняются локально; плагин строит по ним графики для выбранного поля. Отдельных веб-сервиса, HTTP API и многопользовательского режима в проекте нет.</w:t>
+        <w:t>Water Regime GIS реализована как личный плагин QGIS для macOS. Меню, панель инструментов и dock-панель запускают операции PyQGIS/GDAL в фоновых задачах QgsTask. Пользователь выбирает поле на карте; граница уточняется через НСПД WMS GetFeatureInfo, а при отсутствии подходящего контура остаётся рабочий буфер. Sentinel-2 L2A и Sentinel-1 RTC поступают из Microsoft Planetary Computer STAC и читаются GDAL как COG через /vsicurl/. Обрезанные GeoTIFF, маски облачности и таблицы зональных средних сохраняются локально, после чего плагин строит графики выбранного поля. В проекте нет отдельного веб-сервиса, HTTP API и многопользовательского режима.</w:t>
       </w:r>
     </w:p>
     <w:p>
@@ -190,7 +186,7 @@
           <w:rFonts w:ascii="Times New Roman" w:hAnsi="Times New Roman" w:cs="Times New Roman"/>
           <w:b w:val="0"/>
         </w:rPr>
-        <w:t>Анализ охватывает поля SP с апреля по август 2026 года. Используются границы полей, безоблачные сцены Sentinel-2, Sentinel-1 RTC, суточные модельные ряды КОРНИКС и метеорологические данные. Для Sentinel-2 отбираются сцены с глобальной облачностью не выше 10%; дополнительно исключаются сцены с облачностью внутри поля более 20%. Временные ряды индексов и FCOVER рассчитываются как зональные средние валидных пикселей.</w:t>
+        <w:t>В анализ включены поля SP за период с апреля по август 2026 года. Используются их границы, безоблачные снимки Sentinel-2, Sentinel-1 RTC, суточные ряды КОРНИКС и метеоданные. Снимки Sentinel-2 отбираются при глобальной облачности не выше 10%, а сцены с облачностью внутри поля более 20% исключаются. Индексы и FCOVER усредняются по валидным пикселям каждого поля.</w:t>
       </w:r>
     </w:p>
     <w:p>
@@ -204,7 +200,7 @@
           <w:rFonts w:ascii="Times New Roman" w:hAnsi="Times New Roman" w:cs="Times New Roman"/>
           <w:b w:val="0"/>
         </w:rPr>
-        <w:t>Для Sentinel-1 сохраняются VV и VH каждого RTC-снимка, а зональное среднее вычисляется в dB как 10·log10 от среднего линейного обратного рассеяния. В QGIS ряд VV показывается как относительный индикатор влажности на общей сезонной шкале; он не интерпретируется как процент влажности без калибровки наземными измерениями. Ряды Sentinel-2 и Sentinel-1 объединяются с КОРНИКС по нормализованному идентификатору поля и точной дате [3].</w:t>
+        <w:t>Для каждого Sentinel-1 RTC-снимка сохраняются поляризации VV и VH. Зональное среднее вычисляется в dB как 10·log10 от среднего линейного обратного рассеяния. В QGIS ряд VV показан как относительный индикатор влажности на общей сезонной шкале: без калибровки наземными измерениями он не выражает влажность в процентах. Ряды Sentinel-2 и Sentinel-1 объединяются с КОРНИКС по нормализованному идентификатору поля и точной дате [3].</w:t>
       </w:r>
     </w:p>
     <w:p>
@@ -225,7 +221,7 @@
           <w:rFonts w:ascii="Times New Roman" w:hAnsi="Times New Roman" w:cs="Times New Roman"/>
           <w:b w:val="0"/>
         </w:rPr>
-        <w:t>Для 37 полей сформированы временные ряды спутниковых индексов, FCOVER, VV/VH и суточных показателей КОРНИКС. В интерфейсе QGIS для выбранного поля синхронно отображаются сезонные кривые Sentinel-2, модельные покрытие, Ks, влага 0–10 см и ET/PET, а также радиолокационный индикатор. Это позволяет сопоставлять динамику без подмены модельных рядов независимыми наземными измерениями.</w:t>
+        <w:t>Для 37 полей собраны временные ряды спутниковых индексов, FCOVER, VV/VH и суточных показателей КОРНИКС. В QGIS для выбранного поля синхронно показаны сезонные кривые Sentinel-2, модельные покрытие, Ks, влага 0–10 см и ET/PET, а также радиолокационный индикатор. Такое представление позволяет сопоставлять динамику, не выдавая модельные ряды за независимые наземные измерения.</w:t>
       </w:r>
     </w:p>
     <w:p>
@@ -239,7 +235,7 @@
           <w:rFonts w:ascii="Times New Roman" w:hAnsi="Times New Roman" w:cs="Times New Roman"/>
           <w:b w:val="0"/>
         </w:rPr>
-        <w:t>Точное объединение Sentinel-2 с методом КОРНИКС ivanov_n4l_meteo_soil дало 433 совпадения «поле–дата». Сопоставление FCOVER с ожидаемым покрытием выполняется отдельно для каждого поля, а связь Sentinel-1 с модельной влагой оценивается с учётом сумм осадков и полива за 3 и 7 суток. Эти результаты являются пилотной проверкой согласованности источников, а не калибровкой по наземной влаге.</w:t>
+        <w:t>Точное объединение Sentinel-2 с методом КОРНИКС ivanov_n4l_meteo_soil сформировало 433 пары «поле–дата». FCOVER сопоставляется с ожидаемым покрытием по каждому полю, а связь Sentinel-1 с модельной влагой оценивается с учётом осадков и полива за 3 и 7 суток. Это пилотная проверка согласованности источников, а не калибровка по наземной влаге.</w:t>
       </w:r>
     </w:p>
     <w:p>
@@ -260,7 +256,7 @@
           <w:rFonts w:ascii="Times New Roman" w:hAnsi="Times New Roman" w:cs="Times New Roman"/>
           <w:b w:val="0"/>
         </w:rPr>
-        <w:t>Созданная QGIS-система обеспечивает воспроизводимую обработку спутниковых данных и модельных рядов по отдельным полям и их визуальное сопоставление. Sentinel-1 в текущем проекте служит относительным proxy, а не измерением влажности в процентах. Следующий этап — подключение реальных наземных измерений для калибровки и независимой проверки оценок влажности.</w:t>
+        <w:t>Система на базе QGIS обеспечивает воспроизводимую обработку спутниковых данных и модельных рядов по отдельным полям и их наглядное сопоставление. Sentinel-1 в нынешней реализации остаётся относительным proxy, а не измерением влажности в процентах. Следующий шаг — подключить реальные наземные измерения для калибровки и независимой проверки оценок.</w:t>
       </w:r>
     </w:p>
     <w:p>

</xml_diff>

<commit_message>
Rewrite conference thesis document
</commit_message>
<xml_diff>
--- a/output/docx/Тезисы_оценка_влажности_почвы_по_ДЗЗ_и_модели.docx
+++ b/output/docx/Тезисы_оценка_влажности_почвы_по_ДЗЗ_и_модели.docx
@@ -5,13 +5,12 @@
     <w:p>
       <w:pPr>
         <w:spacing w:line="360" w:lineRule="auto" w:before="0" w:after="0"/>
-        <w:jc w:val="left"/>
+        <w:jc w:val="both"/>
       </w:pPr>
       <w:r>
         <w:rPr>
           <w:rFonts w:ascii="Times New Roman" w:hAnsi="Times New Roman"/>
           <w:b w:val="0"/>
-          <w:i w:val="0"/>
           <w:sz w:val="24"/>
         </w:rPr>
         <w:t>УДК 004.6:631.67</w:t>
@@ -26,10 +25,9 @@
         <w:rPr>
           <w:rFonts w:ascii="Times New Roman" w:hAnsi="Times New Roman"/>
           <w:b/>
-          <w:i w:val="0"/>
           <w:sz w:val="24"/>
         </w:rPr>
-        <w:t>ОЦЕНКА ВЛАЖНОСТИ ПОЧВЫ НА СЕЛЬСКОХОЗЯЙСТВЕННЫХ ПОЛЯХ ПО СПУТНИКОВЫМ ДАННЫМ И ФИЗИЧЕСКИ ОБОСНОВАННОЙ МОДЕЛИ</w:t>
+        <w:t>МЕЖПОЛЕВАЯ ПРОВЕРКА РАСЧЕТНОЙ ВЛАЖНОСТИ ПОЧВЫ КОРНИКС ПО ДАННЫМ SENTINEL-1 И SENTINEL-2</w:t>
       </w:r>
     </w:p>
     <w:p>
@@ -41,7 +39,6 @@
         <w:rPr>
           <w:rFonts w:ascii="Times New Roman" w:hAnsi="Times New Roman"/>
           <w:b/>
-          <w:i w:val="0"/>
           <w:sz w:val="24"/>
         </w:rPr>
         <w:t>[Фамилия Имя Отчество автора]</w:t>
@@ -56,7 +53,6 @@
         <w:rPr>
           <w:rFonts w:ascii="Times New Roman" w:hAnsi="Times New Roman"/>
           <w:b w:val="0"/>
-          <w:i w:val="0"/>
           <w:sz w:val="24"/>
         </w:rPr>
         <w:t>[Организация, город, Россия]</w:t>
@@ -71,7 +67,6 @@
         <w:rPr>
           <w:rFonts w:ascii="Times New Roman" w:hAnsi="Times New Roman"/>
           <w:b w:val="0"/>
-          <w:i w:val="0"/>
           <w:sz w:val="24"/>
         </w:rPr>
         <w:t>[e-mail автора]</w:t>
@@ -85,17 +80,19 @@
       </w:pPr>
       <w:r>
         <w:rPr>
-          <w:rFonts w:ascii="Times New Roman" w:hAnsi="Times New Roman" w:cs="Times New Roman"/>
+          <w:rFonts w:ascii="Times New Roman" w:hAnsi="Times New Roman"/>
           <w:b/>
+          <w:sz w:val="24"/>
         </w:rPr>
         <w:t xml:space="preserve">Аннотация. </w:t>
       </w:r>
       <w:r>
         <w:rPr>
-          <w:rFonts w:ascii="Times New Roman" w:hAnsi="Times New Roman" w:cs="Times New Roman"/>
+          <w:rFonts w:ascii="Times New Roman" w:hAnsi="Times New Roman"/>
           <w:b w:val="0"/>
+          <w:sz w:val="24"/>
         </w:rPr>
-        <w:t>В работе описана геоинформационная система для оценки состояния сельскохозяйственных полей, реализованная как персональный плагин QGIS. Она объединяет границы полей, сцены Sentinel-2 и Sentinel-1, суточные модельные ряды КОРНИКС и метеоданные. За вегетационный период 2026 года система формирует временные ряды NDVI, NDMI, NDRE, SAVI, FCOVER и поляризаций VV/VH. Результаты рассчитываются по каждому полю и выводятся на карту и в синхронные графики QGIS.</w:t>
+        <w:t>Проверяется гипотеза о том, что учет растительного покрова повышает переносимость связи между расчетной влажностью КОРНИКС и сигналом Sentinel-1 на новые поля. На 36 полях применена шестикратная межполевая проверка. Модель влажность 0–10 см + FCOVER + взаимодействие дала R²_out=0,137 для VV, превысив упрощенные модели. Это проверка согласованности источников, а не калибровка абсолютной влажности.</w:t>
       </w:r>
     </w:p>
     <w:p>
@@ -106,10 +103,19 @@
       </w:pPr>
       <w:r>
         <w:rPr>
-          <w:rFonts w:ascii="Times New Roman" w:hAnsi="Times New Roman" w:cs="Times New Roman"/>
+          <w:rFonts w:ascii="Times New Roman" w:hAnsi="Times New Roman"/>
+          <w:b/>
+          <w:sz w:val="24"/>
+        </w:rPr>
+        <w:t xml:space="preserve">Ключевые слова: </w:t>
+      </w:r>
+      <w:r>
+        <w:rPr>
+          <w:rFonts w:ascii="Times New Roman" w:hAnsi="Times New Roman"/>
           <w:b w:val="0"/>
+          <w:sz w:val="24"/>
         </w:rPr>
-        <w:t>Ключевые слова: влажность почвы, дистанционное зондирование Земли, QGIS, Sentinel-1, Sentinel-2, FCOVER, КОРНИКС, геоинформационная система.</w:t>
+        <w:t>влажность почвы, дистанционное зондирование Земли, Sentinel-1, Sentinel-2, FCOVER, КОРНИКС, межполевая проверка.</w:t>
       </w:r>
     </w:p>
     <w:p>
@@ -120,17 +126,19 @@
       </w:pPr>
       <w:r>
         <w:rPr>
-          <w:rFonts w:ascii="Times New Roman" w:hAnsi="Times New Roman" w:cs="Times New Roman"/>
+          <w:rFonts w:ascii="Times New Roman" w:hAnsi="Times New Roman"/>
           <w:b/>
+          <w:sz w:val="24"/>
         </w:rPr>
         <w:t xml:space="preserve">Введение. </w:t>
       </w:r>
       <w:r>
         <w:rPr>
-          <w:rFonts w:ascii="Times New Roman" w:hAnsi="Times New Roman" w:cs="Times New Roman"/>
+          <w:rFonts w:ascii="Times New Roman" w:hAnsi="Times New Roman"/>
           <w:b w:val="0"/>
+          <w:sz w:val="24"/>
         </w:rPr>
-        <w:t>Для управления поливом нужна своевременная оценка влагообеспеченности посевов. Точечные датчики влажности не показывают неоднородность поля, связанную со свойствами почвы, микрорельефом и состоянием растительного покрова. Поэтому состояние поля приходится оценивать по данным, охватывающим всю его площадь.</w:t>
+        <w:t>Сигнал Sentinel-1 чувствителен к влажности поверхности, но зависит также от растительности и шероховатости почвы [3]. Поэтому сопоставление VV или VH только с расчетной влажностью КОРНИКС не отделяет влияние покрова от влияния влаги. Проверяется гипотеза: FCOVER повысит переносимость оператора «расчетное состояние поля — Sentinel-1» между полями.</w:t>
       </w:r>
     </w:p>
     <w:p>
@@ -141,10 +149,19 @@
       </w:pPr>
       <w:r>
         <w:rPr>
-          <w:rFonts w:ascii="Times New Roman" w:hAnsi="Times New Roman" w:cs="Times New Roman"/>
+          <w:rFonts w:ascii="Times New Roman" w:hAnsi="Times New Roman"/>
+          <w:b/>
+          <w:sz w:val="24"/>
+        </w:rPr>
+        <w:t xml:space="preserve">Материалы и дизайн эксперимента. </w:t>
+      </w:r>
+      <w:r>
+        <w:rPr>
+          <w:rFonts w:ascii="Times New Roman" w:hAnsi="Times New Roman"/>
           <w:b w:val="0"/>
+          <w:sz w:val="24"/>
         </w:rPr>
-        <w:t>Снимки Sentinel-2 с разрешением 10 м позволяют проследить развитие посевов. В системе рассчитываются NDVI, NDMI, NDRE и SAVI; облака, тени и снег отсеиваются по классификации SCL. По SNAP-совместимой биофизической схеме отдельно определяется FCOVER — доля пикселя, занятая зелёной растительностью [1, 2].</w:t>
+        <w:t>Использована поставка КОРНИКС v006 за апрель—август 2026 года, Sentinel-1 RTC и безоблачные Sentinel-2. FCOVER рассчитывался SNAP-совместимой биофизической схемой [1, 2]. SP 7.3 исключено из анализа. Основной набор содержит 36 полей и 2 118 совпадений «поле—дата Sentinel-1». Поля разделены на шесть фолдов по шесть полей; метрики считались только на полях, не использованных при обучении.</w:t>
       </w:r>
     </w:p>
     <w:p>
@@ -155,17 +172,19 @@
       </w:pPr>
       <w:r>
         <w:rPr>
-          <w:rFonts w:ascii="Times New Roman" w:hAnsi="Times New Roman" w:cs="Times New Roman"/>
+          <w:rFonts w:ascii="Times New Roman" w:hAnsi="Times New Roman"/>
           <w:b/>
+          <w:sz w:val="24"/>
         </w:rPr>
-        <w:t xml:space="preserve">Архитектура информационной системы. </w:t>
+        <w:t xml:space="preserve">Проверяемые модели. </w:t>
       </w:r>
       <w:r>
         <w:rPr>
-          <w:rFonts w:ascii="Times New Roman" w:hAnsi="Times New Roman" w:cs="Times New Roman"/>
+          <w:rFonts w:ascii="Times New Roman" w:hAnsi="Times New Roman"/>
           <w:b w:val="0"/>
+          <w:sz w:val="24"/>
         </w:rPr>
-        <w:t>При реализации информационной системы для распределения геоинформационных данных использован QGIS. Основу составляют локальные геопространственные данные. Для выполнения расчётов разработан модуль на Python, позволяющий загружать контуры полей, временные ряды из внешнего сервиса и снимки Sentinel-1 и Sentinel-2 за заданный интервал с фильтрацией облачных сцен. Растровые, векторные и табличные данные хранятся локально и объединяются проектом QGIS. По спутниковым снимкам рассчитываются индексы. Скрипт сопоставляет временные ряды внешней модели с динамикой индексов и подготавливает данные для построения моделей, описывающих их связь. Система автоматизирована: после поступления новых внешних данных она докачивает спутниковые данные, завершает расчёты и обновляет графики.</w:t>
+        <w:t>Отклик — VV Sentinel-1 в дБ; основной вариант КОРНИКС — междурядье 65 см. Сравнивались Huber-регрессии: M1 — по FCOVER; M2 — по расчетной влажности theta_0_10; M3 — по theta_0_10, FCOVER и их взаимодействию. Осадки и поливы не были признаками модели и использовались только в sensitivity-анализе.</w:t>
       </w:r>
     </w:p>
     <w:p>
@@ -176,17 +195,19 @@
       </w:pPr>
       <w:r>
         <w:rPr>
-          <w:rFonts w:ascii="Times New Roman" w:hAnsi="Times New Roman" w:cs="Times New Roman"/>
+          <w:rFonts w:ascii="Times New Roman" w:hAnsi="Times New Roman"/>
           <w:b/>
+          <w:sz w:val="24"/>
         </w:rPr>
-        <w:t xml:space="preserve">Материалы и методы. </w:t>
+        <w:t xml:space="preserve">Проверка растительного блока. </w:t>
       </w:r>
       <w:r>
         <w:rPr>
-          <w:rFonts w:ascii="Times New Roman" w:hAnsi="Times New Roman" w:cs="Times New Roman"/>
+          <w:rFonts w:ascii="Times New Roman" w:hAnsi="Times New Roman"/>
           <w:b w:val="0"/>
+          <w:sz w:val="24"/>
         </w:rPr>
-        <w:t>В анализ включены поля SP за период с апреля по август 2026 года. Используются их границы, безоблачные снимки Sentinel-2, Sentinel-1 RTC, суточные ряды КОРНИКС и метеоданные. Снимки Sentinel-2 отбираются при глобальной облачности не выше 10%, а сцены с облачностью внутри поля более 20% исключаются. Индексы и FCOVER усредняются по валидным пикселям каждого поля.</w:t>
+        <w:t>Ожидаемый FCOVER КОРНИКС сопоставлялся с FCOVER Sentinel-2 в одинаковые даты. Для 419 совпадений на 36 полях медианный R² составил 0,890; на 21 поле R² не ниже 0,70. Общий лаг равен −12 суток: на графике КОРНИКС сдвигают вправо на 12 суток; бутстрепный интервал — от −16 до −9 суток. Сдвиг не используется в M1—M3.</w:t>
       </w:r>
     </w:p>
     <w:p>
@@ -197,10 +218,19 @@
       </w:pPr>
       <w:r>
         <w:rPr>
-          <w:rFonts w:ascii="Times New Roman" w:hAnsi="Times New Roman" w:cs="Times New Roman"/>
+          <w:rFonts w:ascii="Times New Roman" w:hAnsi="Times New Roman"/>
+          <w:b/>
+          <w:sz w:val="24"/>
+        </w:rPr>
+        <w:t xml:space="preserve">Результаты. </w:t>
+      </w:r>
+      <w:r>
+        <w:rPr>
+          <w:rFonts w:ascii="Times New Roman" w:hAnsi="Times New Roman"/>
           <w:b w:val="0"/>
+          <w:sz w:val="24"/>
         </w:rPr>
-        <w:t>Для каждого Sentinel-1 RTC-снимка сохраняются поляризации VV и VH. Зональное среднее вычисляется в dB как 10·log10 от среднего линейного обратного рассеяния. В QGIS ряд VV показан как относительный индикатор влажности на общей сезонной шкале: без калибровки наземными измерениями он не выражает влажность в процентах. Ряды Sentinel-2 и Sentinel-1 объединяются с КОРНИКС по нормализованному идентификатору поля и точной дате [3].</w:t>
+        <w:t>M1 дала R²_out=0,060, RMSE=2,684 дБ; M2 — 0,113 и 2,608 дБ. Наилучшей оказалась M3: R²_out=0,137, RMSE=2,572 дБ, MAE=1,777 дБ. Медианный прирост R²_out M3 относительно M1 равен 0,078 (95%-й интервал 0,035…0,128), относительно M2 — 0,024 (0,009…0,042). Оба интервала не включают ноль.</w:t>
       </w:r>
     </w:p>
     <w:p>
@@ -211,17 +241,19 @@
       </w:pPr>
       <w:r>
         <w:rPr>
-          <w:rFonts w:ascii="Times New Roman" w:hAnsi="Times New Roman" w:cs="Times New Roman"/>
+          <w:rFonts w:ascii="Times New Roman" w:hAnsi="Times New Roman"/>
           <w:b/>
+          <w:sz w:val="24"/>
         </w:rPr>
-        <w:t xml:space="preserve">Результаты и обсуждение. </w:t>
+        <w:t xml:space="preserve">Проверки устойчивости. </w:t>
       </w:r>
       <w:r>
         <w:rPr>
-          <w:rFonts w:ascii="Times New Roman" w:hAnsi="Times New Roman" w:cs="Times New Roman"/>
+          <w:rFonts w:ascii="Times New Roman" w:hAnsi="Times New Roman"/>
           <w:b w:val="0"/>
+          <w:sz w:val="24"/>
         </w:rPr>
-        <w:t>Для 37 полей собраны временные ряды спутниковых индексов, FCOVER, VV/VH и суточных показателей КОРНИКС. В QGIS для выбранного поля синхронно показаны сезонные кривые Sentinel-2, модельные покрытие, Ks, влага 0–10 см и ET/PET, а также радиолокационный индикатор. Такое представление позволяет сопоставлять динамику, не выдавая модельные ряды за независимые наземные измерения.</w:t>
+        <w:t>Для VH M3 достигла R²_out=0,267 против 0,207 у M2, но интервал разности включил ноль. Вариант 90 см дал те же показатели, что и 65 см: ряды поставки идентичны. На 21 поле с хорошим FCOVER преимущество M3 сохранилось (R²_out=0,146). После исключения дат с осадками или поливом результат снизился до 0,028.</w:t>
       </w:r>
     </w:p>
     <w:p>
@@ -232,10 +264,19 @@
       </w:pPr>
       <w:r>
         <w:rPr>
-          <w:rFonts w:ascii="Times New Roman" w:hAnsi="Times New Roman" w:cs="Times New Roman"/>
+          <w:rFonts w:ascii="Times New Roman" w:hAnsi="Times New Roman"/>
+          <w:b/>
+          <w:sz w:val="24"/>
+        </w:rPr>
+        <w:t xml:space="preserve">Обсуждение. </w:t>
+      </w:r>
+      <w:r>
+        <w:rPr>
+          <w:rFonts w:ascii="Times New Roman" w:hAnsi="Times New Roman"/>
           <w:b w:val="0"/>
+          <w:sz w:val="24"/>
         </w:rPr>
-        <w:t>Точное объединение Sentinel-2 с методом КОРНИКС ivanov_n4l_meteo_soil сформировало 433 пары «поле–дата». FCOVER сопоставляется с ожидаемым покрытием по каждому полю, а связь Sentinel-1 с модельной влагой оценивается с учётом осадков и полива за 3 и 7 суток. Это пилотная проверка согласованности источников, а не калибровка по наземной влаге.</w:t>
+        <w:t>Гипотеза подтверждается в пределах изученной выборки: покров необходимо учитывать при сопоставлении Sentinel-1 с расчетной влагой. Однако R²_out=0,137 недостаточен для трактовки Sentinel-1 как прямого измерителя влажности. Физическая точность не установлена без независимых наземных измерений.</w:t>
       </w:r>
     </w:p>
     <w:p>
@@ -246,29 +287,30 @@
       </w:pPr>
       <w:r>
         <w:rPr>
-          <w:rFonts w:ascii="Times New Roman" w:hAnsi="Times New Roman" w:cs="Times New Roman"/>
+          <w:rFonts w:ascii="Times New Roman" w:hAnsi="Times New Roman"/>
           <w:b/>
+          <w:sz w:val="24"/>
         </w:rPr>
         <w:t xml:space="preserve">Заключение. </w:t>
       </w:r>
       <w:r>
         <w:rPr>
-          <w:rFonts w:ascii="Times New Roman" w:hAnsi="Times New Roman" w:cs="Times New Roman"/>
+          <w:rFonts w:ascii="Times New Roman" w:hAnsi="Times New Roman"/>
           <w:b w:val="0"/>
+          <w:sz w:val="24"/>
         </w:rPr>
-        <w:t>Система на базе QGIS обеспечивает воспроизводимую обработку спутниковых данных и модельных рядов по отдельным полям и их наглядное сопоставление. Sentinel-1 в нынешней реализации остаётся относительным proxy, а не измерением влажности в процентах. Следующий шаг — подключить реальные наземные измерения для калибровки и независимой проверки оценок.</w:t>
+        <w:t>Схема Sentinel-2 → Sentinel-1 отделяет проверку растительного блока от проверки оператора верхнего слоя. Для 36 полей модель с влажностью, FCOVER и взаимодействием превзошла упрощенные варианты. Следующий этап — синхронные наземные измерения влажности и покрытия.</w:t>
       </w:r>
     </w:p>
     <w:p>
       <w:pPr>
         <w:spacing w:line="360" w:lineRule="auto" w:before="120" w:after="0"/>
-        <w:jc w:val="left"/>
+        <w:jc w:val="both"/>
       </w:pPr>
       <w:r>
         <w:rPr>
           <w:rFonts w:ascii="Times New Roman" w:hAnsi="Times New Roman"/>
           <w:b/>
-          <w:i w:val="0"/>
           <w:sz w:val="24"/>
         </w:rPr>
         <w:t>Список источников</w:t>
@@ -284,7 +326,6 @@
         <w:rPr>
           <w:rFonts w:ascii="Times New Roman" w:hAnsi="Times New Roman"/>
           <w:b w:val="0"/>
-          <w:i w:val="0"/>
           <w:sz w:val="24"/>
         </w:rPr>
         <w:t>1. Drusch M., Del Bello U., Carlier S. et al. Sentinel-2: ESA’s Optical High-Resolution Mission for GMES Operational Services. Remote Sensing of Environment. 2012. Vol. 120. P. 25–36.</w:t>
@@ -300,7 +341,6 @@
         <w:rPr>
           <w:rFonts w:ascii="Times New Roman" w:hAnsi="Times New Roman"/>
           <w:b w:val="0"/>
-          <w:i w:val="0"/>
           <w:sz w:val="24"/>
         </w:rPr>
         <w:t>2. Copernicus Global Land Service. FCOVER: Fraction of Green Vegetation Cover. Product User Manual. European Union, 2024.</w:t>
@@ -316,10 +356,9 @@
         <w:rPr>
           <w:rFonts w:ascii="Times New Roman" w:hAnsi="Times New Roman"/>
           <w:b w:val="0"/>
-          <w:i w:val="0"/>
           <w:sz w:val="24"/>
         </w:rPr>
-        <w:t>3. Bauer-Marschallinger B. et al. Toward Global Soil Moisture Monitoring with Sentinel-1. IEEE Transactions on Geoscience and Remote Sensing. 2019. Vol. 57, no. 1. P. 520-539.</w:t>
+        <w:t>3. Bauer-Marschallinger B. et al. Toward Global Soil Moisture Monitoring with Sentinel-1. IEEE Transactions on Geoscience and Remote Sensing. 2019. Vol. 57, no. 1. P. 520–539.</w:t>
       </w:r>
     </w:p>
     <w:sectPr>

</xml_diff>